<commit_message>
Remove doc builders and simplify architecture wording for demo.
Drop report/viva generators, refresh deliverables, lower demo reorder levels so stock stays In stock after Demo A/B, and add the products handout.

Co-authored-by: Cursor <cursoragent@cursor.com>
</commit_message>
<xml_diff>
--- a/docs/viva/Tranz-Algo_Presentation_Training_Guide.docx
+++ b/docs/viva/Tranz-Algo_Presentation_Training_Guide.docx
@@ -31,6 +31,8 @@
         <w:br/>
         <w:t>Nixon Shibuchi · Musonda Katongo</w:t>
         <w:br/>
+        <w:t>Slot: 15 minutes total (PPT ≈ 5 · live demo ≈ 5–6 · questions ≈ 4–5)</w:t>
+        <w:br/>
         <w:t>Aligned with short demos (SHP-DEMO-LOCAL-ZMW + SHP-DEMO-AUTO-FX)</w:t>
       </w:r>
     </w:p>
@@ -59,7 +61,7 @@
           <w:i w:val="0"/>
           <w:sz w:val="22"/>
         </w:rPr>
-        <w:t>Markers care less about fancy UI and more about whether you understand the problem, the formulas, the architecture, and that the prototype works. Your talk should prove four things:</w:t>
+        <w:t>You have about 15 minutes for slides, live demo, and questions. Markers care less about fancy UI and more about whether you understand the problem, the formulas, the architecture, and that the prototype works. Your talk should prove four things:</w:t>
       </w:r>
     </w:p>
     <w:p>
@@ -169,7 +171,135 @@
           <w:i w:val="0"/>
           <w:sz w:val="32"/>
         </w:rPr>
-        <w:t>2. Suggested talk structure (about 8–12 minutes)</w:t>
+        <w:t>2. Time budget (15 minutes total)</w:t>
+      </w:r>
+    </w:p>
+    <w:p>
+      <w:pPr>
+        <w:spacing w:after="160" w:before="0"/>
+      </w:pPr>
+      <w:r>
+        <w:rPr>
+          <w:rFonts w:ascii="Calibri" w:hAnsi="Calibri" w:eastAsia="Calibri"/>
+          <w:b/>
+          <w:i w:val="0"/>
+          <w:sz w:val="22"/>
+        </w:rPr>
+        <w:t>Plan for a hard cut between parts. Prefer finishing the PPT early over eating into the demo.</w:t>
+      </w:r>
+    </w:p>
+    <w:p>
+      <w:pPr>
+        <w:pStyle w:val="ListBullet"/>
+        <w:spacing w:after="80"/>
+      </w:pPr>
+      <w:r>
+        <w:rPr>
+          <w:rFonts w:ascii="Calibri" w:hAnsi="Calibri" w:eastAsia="Calibri"/>
+          <w:b/>
+          <w:i w:val="0"/>
+          <w:sz w:val="22"/>
+        </w:rPr>
+        <w:t xml:space="preserve">PPT: </w:t>
+      </w:r>
+      <w:r>
+        <w:rPr>
+          <w:rFonts w:ascii="Calibri" w:hAnsi="Calibri" w:eastAsia="Calibri"/>
+          <w:b w:val="0"/>
+          <w:i w:val="0"/>
+          <w:sz w:val="22"/>
+        </w:rPr>
+        <w:t>~5 minutes — PowerPoint only (problem → build → architecture → one formula → handoff).</w:t>
+      </w:r>
+    </w:p>
+    <w:p>
+      <w:pPr>
+        <w:pStyle w:val="ListBullet"/>
+        <w:spacing w:after="80"/>
+      </w:pPr>
+      <w:r>
+        <w:rPr>
+          <w:rFonts w:ascii="Calibri" w:hAnsi="Calibri" w:eastAsia="Calibri"/>
+          <w:b/>
+          <w:i w:val="0"/>
+          <w:sz w:val="22"/>
+        </w:rPr>
+        <w:t xml:space="preserve">Demo: </w:t>
+      </w:r>
+      <w:r>
+        <w:rPr>
+          <w:rFonts w:ascii="Calibri" w:hAnsi="Calibri" w:eastAsia="Calibri"/>
+          <w:b w:val="0"/>
+          <w:i w:val="0"/>
+          <w:sz w:val="22"/>
+        </w:rPr>
+        <w:t>~5–6 minutes — live demo (Demo A full; Demo B short if time).</w:t>
+      </w:r>
+    </w:p>
+    <w:p>
+      <w:pPr>
+        <w:pStyle w:val="ListBullet"/>
+        <w:spacing w:after="80"/>
+      </w:pPr>
+      <w:r>
+        <w:rPr>
+          <w:rFonts w:ascii="Calibri" w:hAnsi="Calibri" w:eastAsia="Calibri"/>
+          <w:b/>
+          <w:i w:val="0"/>
+          <w:sz w:val="22"/>
+        </w:rPr>
+        <w:t xml:space="preserve">Q&amp;A: </w:t>
+      </w:r>
+      <w:r>
+        <w:rPr>
+          <w:rFonts w:ascii="Calibri" w:hAnsi="Calibri" w:eastAsia="Calibri"/>
+          <w:b w:val="0"/>
+          <w:i w:val="0"/>
+          <w:sz w:val="22"/>
+        </w:rPr>
+        <w:t>~4–5 minutes — panel questions (keep answers short; leave buffer).</w:t>
+      </w:r>
+    </w:p>
+    <w:p>
+      <w:pPr>
+        <w:spacing w:after="160" w:before="0"/>
+      </w:pPr>
+      <w:r>
+        <w:rPr>
+          <w:rFonts w:ascii="Calibri" w:hAnsi="Calibri" w:eastAsia="Calibri"/>
+          <w:b w:val="0"/>
+          <w:i/>
+          <w:sz w:val="22"/>
+        </w:rPr>
+        <w:t>If the panel starts questions mid-demo, answer briefly and return to the screen — do not restart the PPT.</w:t>
+      </w:r>
+    </w:p>
+    <w:p>
+      <w:pPr>
+        <w:pStyle w:val="Heading1"/>
+      </w:pPr>
+      <w:r>
+        <w:rPr>
+          <w:rFonts w:ascii="Calibri" w:hAnsi="Calibri" w:eastAsia="Calibri"/>
+          <w:b/>
+          <w:i w:val="0"/>
+          <w:sz w:val="32"/>
+        </w:rPr>
+        <w:t>3. PPT script (~5 minutes — keep it tight)</w:t>
+      </w:r>
+    </w:p>
+    <w:p>
+      <w:pPr>
+        <w:spacing w:after="160" w:before="0"/>
+      </w:pPr>
+      <w:r>
+        <w:rPr>
+          <w:rFonts w:ascii="Calibri" w:hAnsi="Calibri" w:eastAsia="Calibri"/>
+          <w:b w:val="0"/>
+          <w:i/>
+          <w:sz w:val="22"/>
+        </w:rPr>
+        <w:t>Do not read every slide. Skip or flash Development Environment / long challenge lists. Say the must-say lines while advancing slides.</w:t>
       </w:r>
     </w:p>
     <w:p>
@@ -183,7 +313,7 @@
           <w:i w:val="0"/>
           <w:sz w:val="26"/>
         </w:rPr>
-        <w:t>Minute 0–1 · Opening</w:t>
+        <w:t>0:00–0:30 · Opening</w:t>
       </w:r>
     </w:p>
     <w:p>
@@ -197,7 +327,7 @@
           <w:i w:val="0"/>
           <w:sz w:val="22"/>
         </w:rPr>
-        <w:t>State title, names, and one sentence aim: “Tranz-Algo helps importers recover per-item landed cost, suggest safe retail prices, and track stock by shipment batch.”</w:t>
+        <w:t>Title, both names, one sentence aim: “Tranz-Algo helps importers recover per-item landed cost, suggest safe retail prices, and track stock by shipment batch.”</w:t>
       </w:r>
     </w:p>
     <w:p>
@@ -211,7 +341,7 @@
           <w:i w:val="0"/>
           <w:sz w:val="26"/>
         </w:rPr>
-        <w:t>Minute 1–3 · Problem &amp; gap</w:t>
+        <w:t>0:30–1:30 · Problem &amp; gap</w:t>
       </w:r>
     </w:p>
     <w:p>
@@ -226,7 +356,7 @@
           <w:i w:val="0"/>
           <w:sz w:val="22"/>
         </w:rPr>
-        <w:t>Shared shipping/tax are hard to split fairly.</w:t>
+        <w:t>Shared shipping / duty / VAT are hard to split fairly across items.</w:t>
       </w:r>
     </w:p>
     <w:p>
@@ -256,7 +386,7 @@
           <w:i w:val="0"/>
           <w:sz w:val="22"/>
         </w:rPr>
-        <w:t>Spreadsheets are opaque; POS/ERP often don’t solve this niche well for SMEs.</w:t>
+        <w:t>Spreadsheets are opaque; POS/ERP rarely solve this niche for SMEs.</w:t>
       </w:r>
     </w:p>
     <w:p>
@@ -284,7 +414,7 @@
           <w:i w:val="0"/>
           <w:sz w:val="26"/>
         </w:rPr>
-        <w:t>Minute 3–5 · Objectives &amp; what we built</w:t>
+        <w:t>1:30–2:30 · What we built (objectives — 4 bullets max)</w:t>
       </w:r>
     </w:p>
     <w:p>
@@ -299,7 +429,7 @@
           <w:i w:val="0"/>
           <w:sz w:val="22"/>
         </w:rPr>
-        <w:t>FX-aware costing (Auto FX) + Already-Local paste mode.</w:t>
+        <w:t>Dual modes: Already-Local + Auto FX.</w:t>
       </w:r>
     </w:p>
     <w:p>
@@ -314,7 +444,7 @@
           <w:i w:val="0"/>
           <w:sz w:val="22"/>
         </w:rPr>
-        <w:t>Allocation by quantity/weight (engine also supports value).</w:t>
+        <w:t>Allocate shipping/duty/VAT; suggest retail; Cost history on commit.</w:t>
       </w:r>
     </w:p>
     <w:p>
@@ -329,7 +459,7 @@
           <w:i w:val="0"/>
           <w:sz w:val="22"/>
         </w:rPr>
-        <w:t>Price suggestion (margin % or manual) + Cost history.</w:t>
+        <w:t>Stock by batch + Record sale (not a POS).</w:t>
       </w:r>
     </w:p>
     <w:p>
@@ -344,7 +474,49 @@
           <w:i w:val="0"/>
           <w:sz w:val="22"/>
         </w:rPr>
-        <w:t>Inventory by batch + Record sale + True-Cost Ledger.</w:t>
+        <w:t>React admin + FastAPI + PostgreSQL (JWT).</w:t>
+      </w:r>
+    </w:p>
+    <w:p>
+      <w:pPr>
+        <w:pStyle w:val="Heading2"/>
+      </w:pPr>
+      <w:r>
+        <w:rPr>
+          <w:rFonts w:ascii="Calibri" w:hAnsi="Calibri" w:eastAsia="Calibri"/>
+          <w:b/>
+          <w:i w:val="0"/>
+          <w:sz w:val="26"/>
+        </w:rPr>
+        <w:t>2:30–3:30 · Architecture (one diagram, one sentence)</w:t>
+      </w:r>
+    </w:p>
+    <w:p>
+      <w:pPr>
+        <w:spacing w:after="160" w:before="0"/>
+      </w:pPr>
+      <w:r>
+        <w:rPr>
+          <w:rFonts w:ascii="Calibri" w:hAnsi="Calibri" w:eastAsia="Calibri"/>
+          <w:b w:val="0"/>
+          <w:i w:val="0"/>
+          <w:sz w:val="22"/>
+        </w:rPr>
+        <w:t>Show the three-tier diagram and say only: “React frontend talks to FastAPI; services do costing and shipment workflow; PostgreSQL stores the data.” Save framework detail for Q&amp;A (Technology Q&amp;A Section 3). Do not lead with Facade/Strategy names on the clock.</w:t>
+      </w:r>
+    </w:p>
+    <w:p>
+      <w:pPr>
+        <w:pStyle w:val="Heading2"/>
+      </w:pPr>
+      <w:r>
+        <w:rPr>
+          <w:rFonts w:ascii="Calibri" w:hAnsi="Calibri" w:eastAsia="Calibri"/>
+          <w:b/>
+          <w:i w:val="0"/>
+          <w:sz w:val="26"/>
+        </w:rPr>
+        <w:t>3:30–4:30 · Dual modes + core formulas (Algorithms slide)</w:t>
       </w:r>
     </w:p>
     <w:p>
@@ -359,77 +531,7 @@
           <w:i w:val="0"/>
           <w:sz w:val="22"/>
         </w:rPr>
-        <w:t>Secure admin (JWT) web dashboard on PostgreSQL.</w:t>
-      </w:r>
-    </w:p>
-    <w:p>
-      <w:pPr>
-        <w:pStyle w:val="Heading2"/>
-      </w:pPr>
-      <w:r>
-        <w:rPr>
-          <w:rFonts w:ascii="Calibri" w:hAnsi="Calibri" w:eastAsia="Calibri"/>
-          <w:b/>
-          <w:i w:val="0"/>
-          <w:sz w:val="26"/>
-        </w:rPr>
-        <w:t>Minute 5–7 · Architecture (keep light)</w:t>
-      </w:r>
-    </w:p>
-    <w:p>
-      <w:pPr>
-        <w:spacing w:after="160" w:before="0"/>
-      </w:pPr>
-      <w:r>
-        <w:rPr>
-          <w:rFonts w:ascii="Calibri" w:hAnsi="Calibri" w:eastAsia="Calibri"/>
-          <w:b w:val="0"/>
-          <w:i w:val="0"/>
-          <w:sz w:val="22"/>
-        </w:rPr>
-        <w:t>Show the three-tier diagram and say only: “Browser (React + Vite) talks to FastAPI; Pydantic validates inputs; SQLAlchemy talks to PostgreSQL; our services do costing.” If asked to explain frameworks: use Section 3 of the Technology Q&amp;A doc. Do not lead with pattern names. If a panelist asks what Facade/Strategy mean: “Facade is the one workflow that allocates, prices, and commits; Strategy means we can swap quantity vs weight (or Already-Local vs Auto FX) without rewriting the whole app.” Details are in the Code Map viva doc. If asked about React Native in the proposal: use the justification sentence from the Q&amp;A document. If asked about Supabase: “We run Postgres locally; DATABASE_URL can point to cloud.” If asked why FxRateCache is standalone on the ERD: “It is market memory for USD→ZMW; each shipment keeps its own applied rate so later Fetch FX does not rewrite that batch’s costing.”</w:t>
-      </w:r>
-    </w:p>
-    <w:p>
-      <w:pPr>
-        <w:pStyle w:val="Heading2"/>
-      </w:pPr>
-      <w:r>
-        <w:rPr>
-          <w:rFonts w:ascii="Calibri" w:hAnsi="Calibri" w:eastAsia="Calibri"/>
-          <w:b/>
-          <w:i w:val="0"/>
-          <w:sz w:val="26"/>
-        </w:rPr>
-        <w:t>Minute 7–11 · Live demo (most important)</w:t>
-      </w:r>
-    </w:p>
-    <w:p>
-      <w:pPr>
-        <w:spacing w:after="160" w:before="0"/>
-      </w:pPr>
-      <w:r>
-        <w:rPr>
-          <w:rFonts w:ascii="Calibri" w:hAnsi="Calibri" w:eastAsia="Calibri"/>
-          <w:b/>
-          <w:i w:val="0"/>
-          <w:sz w:val="22"/>
-        </w:rPr>
-        <w:t>Use the handout docs/viva/Tranz-Algo_Demo_Shipment_Data.docx (and How to Use the App). Rehearse until muscle memory:</w:t>
-      </w:r>
-    </w:p>
-    <w:p>
-      <w:pPr>
-        <w:spacing w:after="80" w:before="0"/>
-      </w:pPr>
-      <w:r>
-        <w:rPr>
-          <w:rFonts w:ascii="Calibri" w:hAnsi="Calibri" w:eastAsia="Calibri"/>
-          <w:b/>
-          <w:i w:val="0"/>
-          <w:sz w:val="22"/>
-        </w:rPr>
-        <w:t>Demo A — Already-Local (landed cost)</w:t>
+        <w:t>Auto FX: LocalProduct = ForeignUnit × Rate; Already-Local uses LocalUnitCost.</w:t>
       </w:r>
     </w:p>
     <w:p>
@@ -444,7 +546,7 @@
           <w:i w:val="0"/>
           <w:sz w:val="22"/>
         </w:rPr>
-        <w:t>Import products_demo.csv, then shipment_A_full.csv (or Clear drafts first).</w:t>
+        <w:t>Share_i = (basis_i / Σ basis) × total  (qty or weight for shipping, duty, VAT).</w:t>
       </w:r>
     </w:p>
     <w:p>
@@ -459,7 +561,7 @@
           <w:i w:val="0"/>
           <w:sz w:val="22"/>
         </w:rPr>
-        <w:t>SHP-DEMO-LOCAL-ZMW → costs 5000 / 1000 / 1500.</w:t>
+        <w:t>LandedUnit = (LocalProduct×qty + shares) ÷ qty.</w:t>
       </w:r>
     </w:p>
     <w:p>
@@ -474,21 +576,35 @@
           <w:i w:val="0"/>
           <w:sz w:val="22"/>
         </w:rPr>
-        <w:t>True Cost: quantity → margin 0.30 → commit. Landed e.g. 170 / 107 / 160 / 120 / 93.</w:t>
+        <w:t>SuggestedRP = LandedUnit × (1 + margin); floor = LandedUnit × 1.10.</w:t>
       </w:r>
     </w:p>
     <w:p>
       <w:pPr>
-        <w:spacing w:after="80" w:before="0"/>
+        <w:spacing w:after="160" w:before="0"/>
+      </w:pPr>
+      <w:r>
+        <w:rPr>
+          <w:rFonts w:ascii="Calibri" w:hAnsi="Calibri" w:eastAsia="Calibri"/>
+          <w:b w:val="0"/>
+          <w:i/>
+          <w:sz w:val="22"/>
+        </w:rPr>
+        <w:t>Point at the formula lines — do not derive Demo A live on the slide. One breath on evaluation: “Demo A/B match our spreadsheet checks within 0.01 ZMW.”</w:t>
+      </w:r>
+    </w:p>
+    <w:p>
+      <w:pPr>
+        <w:pStyle w:val="Heading2"/>
       </w:pPr>
       <w:r>
         <w:rPr>
           <w:rFonts w:ascii="Calibri" w:hAnsi="Calibri" w:eastAsia="Calibri"/>
           <w:b/>
           <w:i w:val="0"/>
-          <w:sz w:val="22"/>
+          <w:sz w:val="26"/>
         </w:rPr>
-        <w:t>Demo B — Auto FX (Fetch FX)</w:t>
+        <w:t>4:30–5:00 · Handoff to demo</w:t>
       </w:r>
     </w:p>
     <w:p>
@@ -503,7 +619,7 @@
           <w:i w:val="0"/>
           <w:sz w:val="22"/>
         </w:rPr>
-        <w:t>Import shipment_B_full.csv.</w:t>
+        <w:t>Limits in one line: not POS; no legal customs API; mobile deferred.</w:t>
       </w:r>
     </w:p>
     <w:p>
@@ -518,7 +634,49 @@
           <w:i w:val="0"/>
           <w:sz w:val="22"/>
         </w:rPr>
-        <w:t>SHP-DEMO-AUTO-FX → rate 20 (CSV / starter) → costs 2800 / 700 / 1050.</w:t>
+        <w:t>“We’ll show Demo A live, then a short Auto FX path if time.” Switch to the browser.</w:t>
+      </w:r>
+    </w:p>
+    <w:p>
+      <w:pPr>
+        <w:pStyle w:val="Heading1"/>
+      </w:pPr>
+      <w:r>
+        <w:rPr>
+          <w:rFonts w:ascii="Calibri" w:hAnsi="Calibri" w:eastAsia="Calibri"/>
+          <w:b/>
+          <w:i w:val="0"/>
+          <w:sz w:val="32"/>
+        </w:rPr>
+        <w:t>4. Live demo (~5–6 minutes — most important)</w:t>
+      </w:r>
+    </w:p>
+    <w:p>
+      <w:pPr>
+        <w:spacing w:after="160" w:before="0"/>
+      </w:pPr>
+      <w:r>
+        <w:rPr>
+          <w:rFonts w:ascii="Calibri" w:hAnsi="Calibri" w:eastAsia="Calibri"/>
+          <w:b/>
+          <w:i w:val="0"/>
+          <w:sz w:val="22"/>
+        </w:rPr>
+        <w:t>App must already be running before the slot starts. Use docs/viva/Tranz-Algo_Demo_Shipment_Data.docx (and How to Use the App). Prefer pre-imported Demo A if CSV is slow on the day.</w:t>
+      </w:r>
+    </w:p>
+    <w:p>
+      <w:pPr>
+        <w:spacing w:after="80" w:before="0"/>
+      </w:pPr>
+      <w:r>
+        <w:rPr>
+          <w:rFonts w:ascii="Calibri" w:hAnsi="Calibri" w:eastAsia="Calibri"/>
+          <w:b/>
+          <w:i w:val="0"/>
+          <w:sz w:val="22"/>
+        </w:rPr>
+        <w:t>Priority path — Demo A Already-Local (~3–4 min)</w:t>
       </w:r>
     </w:p>
     <w:p>
@@ -533,21 +691,7 @@
           <w:i w:val="0"/>
           <w:sz w:val="22"/>
         </w:rPr>
-        <w:t>True Cost: weight → margin 0.25 → commit. @20 → 136.25 / 145 / 46.25 / 92.50.</w:t>
-      </w:r>
-    </w:p>
-    <w:p>
-      <w:pPr>
-        <w:pStyle w:val="Heading2"/>
-      </w:pPr>
-      <w:r>
-        <w:rPr>
-          <w:rFonts w:ascii="Calibri" w:hAnsi="Calibri" w:eastAsia="Calibri"/>
-          <w:b/>
-          <w:i w:val="0"/>
-          <w:sz w:val="26"/>
-        </w:rPr>
-        <w:t>Minute 11–12 · Evaluation, limits, close</w:t>
+        <w:t>Open SHP-DEMO-LOCAL-ZMW (or import shipment_A_full.csv after products).</w:t>
       </w:r>
     </w:p>
     <w:p>
@@ -562,7 +706,7 @@
           <w:i w:val="0"/>
           <w:sz w:val="22"/>
         </w:rPr>
-        <w:t>pytest / spreadsheet oracle within 0.01 ZMW.</w:t>
+        <w:t>Show costs 5000 / 1000 / 1500.</w:t>
       </w:r>
     </w:p>
     <w:p>
@@ -577,7 +721,7 @@
           <w:i w:val="0"/>
           <w:sz w:val="22"/>
         </w:rPr>
-        <w:t>Limits: not full POS; no legal customs assessment API; mobile stretch deferred.</w:t>
+        <w:t>True Cost: quantity → margin 0.30 → commit. Say one landed number (e.g. 170).</w:t>
       </w:r>
     </w:p>
     <w:p>
@@ -592,7 +736,65 @@
           <w:i w:val="0"/>
           <w:sz w:val="22"/>
         </w:rPr>
-        <w:t>Close: restate contribution in one line, thank supervisor/panel, invite questions.</w:t>
+        <w:t>Optional 20 s: Cost history / stock — only if ahead of time.</w:t>
+      </w:r>
+    </w:p>
+    <w:p>
+      <w:pPr>
+        <w:spacing w:after="80" w:before="0"/>
+      </w:pPr>
+      <w:r>
+        <w:rPr>
+          <w:rFonts w:ascii="Calibri" w:hAnsi="Calibri" w:eastAsia="Calibri"/>
+          <w:b/>
+          <w:i w:val="0"/>
+          <w:sz w:val="22"/>
+        </w:rPr>
+        <w:t>If time left — Demo B Auto FX (~1–2 min)</w:t>
+      </w:r>
+    </w:p>
+    <w:p>
+      <w:pPr>
+        <w:pStyle w:val="ListBullet"/>
+        <w:spacing w:after="80"/>
+      </w:pPr>
+      <w:r>
+        <w:rPr>
+          <w:rFonts w:ascii="Calibri" w:hAnsi="Calibri" w:eastAsia="Calibri"/>
+          <w:b w:val="0"/>
+          <w:i w:val="0"/>
+          <w:sz w:val="22"/>
+        </w:rPr>
+        <w:t>Open SHP-DEMO-AUTO-FX; rate 20; costs 2800 / 700 / 1050.</w:t>
+      </w:r>
+    </w:p>
+    <w:p>
+      <w:pPr>
+        <w:pStyle w:val="ListBullet"/>
+        <w:spacing w:after="80"/>
+      </w:pPr>
+      <w:r>
+        <w:rPr>
+          <w:rFonts w:ascii="Calibri" w:hAnsi="Calibri" w:eastAsia="Calibri"/>
+          <w:b w:val="0"/>
+          <w:i w:val="0"/>
+          <w:sz w:val="22"/>
+        </w:rPr>
+        <w:t>True Cost: weight → margin 0.25 → show one landed @20 (e.g. 136.25). Skip Fetch FX if late.</w:t>
+      </w:r>
+    </w:p>
+    <w:p>
+      <w:pPr>
+        <w:spacing w:after="160" w:before="0"/>
+      </w:pPr>
+      <w:r>
+        <w:rPr>
+          <w:rFonts w:ascii="Calibri" w:hAnsi="Calibri" w:eastAsia="Calibri"/>
+          <w:b w:val="0"/>
+          <w:i/>
+          <w:sz w:val="22"/>
+        </w:rPr>
+        <w:t>If only one demo fits: do Demo A completely. Mention Demo B exists for Auto FX / rate 20.</w:t>
       </w:r>
     </w:p>
     <w:p>
@@ -606,7 +808,81 @@
           <w:i w:val="0"/>
           <w:sz w:val="32"/>
         </w:rPr>
-        <w:t>3. What is important to state (must-say lines)</w:t>
+        <w:t>5. Questions (~4–5 minutes)</w:t>
+      </w:r>
+    </w:p>
+    <w:p>
+      <w:pPr>
+        <w:pStyle w:val="ListBullet"/>
+        <w:spacing w:after="80"/>
+      </w:pPr>
+      <w:r>
+        <w:rPr>
+          <w:rFonts w:ascii="Calibri" w:hAnsi="Calibri" w:eastAsia="Calibri"/>
+          <w:b w:val="0"/>
+          <w:i w:val="0"/>
+          <w:sz w:val="22"/>
+        </w:rPr>
+        <w:t>Answer in 2–4 sentences, then stop. Offer to show a screen only if asked.</w:t>
+      </w:r>
+    </w:p>
+    <w:p>
+      <w:pPr>
+        <w:pStyle w:val="ListBullet"/>
+        <w:spacing w:after="80"/>
+      </w:pPr>
+      <w:r>
+        <w:rPr>
+          <w:rFonts w:ascii="Calibri" w:hAnsi="Calibri" w:eastAsia="Calibri"/>
+          <w:b w:val="0"/>
+          <w:i w:val="0"/>
+          <w:sz w:val="22"/>
+        </w:rPr>
+        <w:t>Likely topics: FastAPI/React roles, dual modes, FxRateCache standalone, not a POS, Postgres.</w:t>
+      </w:r>
+    </w:p>
+    <w:p>
+      <w:pPr>
+        <w:pStyle w:val="ListBullet"/>
+        <w:spacing w:after="80"/>
+      </w:pPr>
+      <w:r>
+        <w:rPr>
+          <w:rFonts w:ascii="Calibri" w:hAnsi="Calibri" w:eastAsia="Calibri"/>
+          <w:b w:val="0"/>
+          <w:i w:val="0"/>
+          <w:sz w:val="22"/>
+        </w:rPr>
+        <w:t>Use Technology Justification &amp; Viva Q&amp;A + Code Map — do not invent new scope.</w:t>
+      </w:r>
+    </w:p>
+    <w:p>
+      <w:pPr>
+        <w:pStyle w:val="ListBullet"/>
+        <w:spacing w:after="80"/>
+      </w:pPr>
+      <w:r>
+        <w:rPr>
+          <w:rFonts w:ascii="Calibri" w:hAnsi="Calibri" w:eastAsia="Calibri"/>
+          <w:b w:val="0"/>
+          <w:i w:val="0"/>
+          <w:sz w:val="22"/>
+        </w:rPr>
+        <w:t>If time runs out mid-demo: “Happy to continue in questions” and take the panel’s lead.</w:t>
+      </w:r>
+    </w:p>
+    <w:p>
+      <w:pPr>
+        <w:pStyle w:val="Heading1"/>
+      </w:pPr>
+      <w:r>
+        <w:rPr>
+          <w:rFonts w:ascii="Calibri" w:hAnsi="Calibri" w:eastAsia="Calibri"/>
+          <w:b/>
+          <w:i w:val="0"/>
+          <w:sz w:val="32"/>
+        </w:rPr>
+        <w:t>6. What is important to state (must-say lines)</w:t>
       </w:r>
     </w:p>
     <w:p>
@@ -764,7 +1040,7 @@
           <w:i w:val="0"/>
           <w:sz w:val="32"/>
         </w:rPr>
-        <w:t>4. Slide outline (if you use PPT)</w:t>
+        <w:t>7. Which PPT slides to speak in 5 minutes</w:t>
       </w:r>
     </w:p>
     <w:p>
@@ -775,10 +1051,10 @@
         <w:rPr>
           <w:rFonts w:ascii="Calibri" w:hAnsi="Calibri" w:eastAsia="Calibri"/>
           <w:b w:val="0"/>
-          <w:i w:val="0"/>
+          <w:i/>
           <w:sz w:val="22"/>
         </w:rPr>
-        <w:t>Prefer Presentation_Template_2026.pptx for the official layout. Keep slides sparse; demo over reading.</w:t>
+        <w:t>You may keep the full deck for backup, but only narrate this path. Flash or skip the rest.</w:t>
       </w:r>
     </w:p>
     <w:p>
@@ -793,7 +1069,7 @@
           <w:i w:val="0"/>
           <w:sz w:val="22"/>
         </w:rPr>
-        <w:t xml:space="preserve">Slide 1: </w:t>
+        <w:t xml:space="preserve">Must speak: </w:t>
       </w:r>
       <w:r>
         <w:rPr>
@@ -802,7 +1078,7 @@
           <w:i w:val="0"/>
           <w:sz w:val="22"/>
         </w:rPr>
-        <w:t>Title + names + supervisor</w:t>
+        <w:t>Title → Problem → Aim/what we built → Architecture diagram.</w:t>
       </w:r>
     </w:p>
     <w:p>
@@ -817,7 +1093,7 @@
           <w:i w:val="0"/>
           <w:sz w:val="22"/>
         </w:rPr>
-        <w:t xml:space="preserve">Slide 2: </w:t>
+        <w:t xml:space="preserve">Must speak: </w:t>
       </w:r>
       <w:r>
         <w:rPr>
@@ -826,7 +1102,7 @@
           <w:i w:val="0"/>
           <w:sz w:val="22"/>
         </w:rPr>
-        <w:t>Problem (3 bullets max)</w:t>
+        <w:t>Dual modes / Algorithms (one formula) → one Evaluation or Discussion line → Live demo handoff.</w:t>
       </w:r>
     </w:p>
     <w:p>
@@ -841,7 +1117,7 @@
           <w:i w:val="0"/>
           <w:sz w:val="22"/>
         </w:rPr>
-        <w:t xml:space="preserve">Slide 3: </w:t>
+        <w:t xml:space="preserve">Skip / flash: </w:t>
       </w:r>
       <w:r>
         <w:rPr>
@@ -850,175 +1126,7 @@
           <w:i w:val="0"/>
           <w:sz w:val="22"/>
         </w:rPr>
-        <w:t>Aim &amp; objectives</w:t>
-      </w:r>
-    </w:p>
-    <w:p>
-      <w:pPr>
-        <w:pStyle w:val="ListBullet"/>
-        <w:spacing w:after="80"/>
-      </w:pPr>
-      <w:r>
-        <w:rPr>
-          <w:rFonts w:ascii="Calibri" w:hAnsi="Calibri" w:eastAsia="Calibri"/>
-          <w:b/>
-          <w:i w:val="0"/>
-          <w:sz w:val="22"/>
-        </w:rPr>
-        <w:t xml:space="preserve">Slide 4: </w:t>
-      </w:r>
-      <w:r>
-        <w:rPr>
-          <w:rFonts w:ascii="Calibri" w:hAnsi="Calibri" w:eastAsia="Calibri"/>
-          <w:b w:val="0"/>
-          <w:i w:val="0"/>
-          <w:sz w:val="22"/>
-        </w:rPr>
-        <w:t>System overview diagram (React → FastAPI → PostgreSQL)</w:t>
-      </w:r>
-    </w:p>
-    <w:p>
-      <w:pPr>
-        <w:pStyle w:val="ListBullet"/>
-        <w:spacing w:after="80"/>
-      </w:pPr>
-      <w:r>
-        <w:rPr>
-          <w:rFonts w:ascii="Calibri" w:hAnsi="Calibri" w:eastAsia="Calibri"/>
-          <w:b/>
-          <w:i w:val="0"/>
-          <w:sz w:val="22"/>
-        </w:rPr>
-        <w:t xml:space="preserve">Slide 5: </w:t>
-      </w:r>
-      <w:r>
-        <w:rPr>
-          <w:rFonts w:ascii="Calibri" w:hAnsi="Calibri" w:eastAsia="Calibri"/>
-          <w:b w:val="0"/>
-          <w:i w:val="0"/>
-          <w:sz w:val="22"/>
-        </w:rPr>
-        <w:t>Dual cost modes</w:t>
-      </w:r>
-    </w:p>
-    <w:p>
-      <w:pPr>
-        <w:pStyle w:val="ListBullet"/>
-        <w:spacing w:after="80"/>
-      </w:pPr>
-      <w:r>
-        <w:rPr>
-          <w:rFonts w:ascii="Calibri" w:hAnsi="Calibri" w:eastAsia="Calibri"/>
-          <w:b/>
-          <w:i w:val="0"/>
-          <w:sz w:val="22"/>
-        </w:rPr>
-        <w:t xml:space="preserve">Slide 6: </w:t>
-      </w:r>
-      <w:r>
-        <w:rPr>
-          <w:rFonts w:ascii="Calibri" w:hAnsi="Calibri" w:eastAsia="Calibri"/>
-          <w:b w:val="0"/>
-          <w:i w:val="0"/>
-          <w:sz w:val="22"/>
-        </w:rPr>
-        <w:t>Landed cost + suggestion formulas</w:t>
-      </w:r>
-    </w:p>
-    <w:p>
-      <w:pPr>
-        <w:pStyle w:val="ListBullet"/>
-        <w:spacing w:after="80"/>
-      </w:pPr>
-      <w:r>
-        <w:rPr>
-          <w:rFonts w:ascii="Calibri" w:hAnsi="Calibri" w:eastAsia="Calibri"/>
-          <w:b/>
-          <w:i w:val="0"/>
-          <w:sz w:val="22"/>
-        </w:rPr>
-        <w:t xml:space="preserve">Slide 7: </w:t>
-      </w:r>
-      <w:r>
-        <w:rPr>
-          <w:rFonts w:ascii="Calibri" w:hAnsi="Calibri" w:eastAsia="Calibri"/>
-          <w:b w:val="0"/>
-          <w:i w:val="0"/>
-          <w:sz w:val="22"/>
-        </w:rPr>
-        <w:t>Demo A / Demo B (or “Live demo” slide)</w:t>
-      </w:r>
-    </w:p>
-    <w:p>
-      <w:pPr>
-        <w:pStyle w:val="ListBullet"/>
-        <w:spacing w:after="80"/>
-      </w:pPr>
-      <w:r>
-        <w:rPr>
-          <w:rFonts w:ascii="Calibri" w:hAnsi="Calibri" w:eastAsia="Calibri"/>
-          <w:b/>
-          <w:i w:val="0"/>
-          <w:sz w:val="22"/>
-        </w:rPr>
-        <w:t xml:space="preserve">Slide 8: </w:t>
-      </w:r>
-      <w:r>
-        <w:rPr>
-          <w:rFonts w:ascii="Calibri" w:hAnsi="Calibri" w:eastAsia="Calibri"/>
-          <w:b w:val="0"/>
-          <w:i w:val="0"/>
-          <w:sz w:val="22"/>
-        </w:rPr>
-        <w:t>Evaluation results</w:t>
-      </w:r>
-    </w:p>
-    <w:p>
-      <w:pPr>
-        <w:pStyle w:val="ListBullet"/>
-        <w:spacing w:after="80"/>
-      </w:pPr>
-      <w:r>
-        <w:rPr>
-          <w:rFonts w:ascii="Calibri" w:hAnsi="Calibri" w:eastAsia="Calibri"/>
-          <w:b/>
-          <w:i w:val="0"/>
-          <w:sz w:val="22"/>
-        </w:rPr>
-        <w:t xml:space="preserve">Slide 9: </w:t>
-      </w:r>
-      <w:r>
-        <w:rPr>
-          <w:rFonts w:ascii="Calibri" w:hAnsi="Calibri" w:eastAsia="Calibri"/>
-          <w:b w:val="0"/>
-          <w:i w:val="0"/>
-          <w:sz w:val="22"/>
-        </w:rPr>
-        <w:t>Limitations &amp; future work</w:t>
-      </w:r>
-    </w:p>
-    <w:p>
-      <w:pPr>
-        <w:pStyle w:val="ListBullet"/>
-        <w:spacing w:after="80"/>
-      </w:pPr>
-      <w:r>
-        <w:rPr>
-          <w:rFonts w:ascii="Calibri" w:hAnsi="Calibri" w:eastAsia="Calibri"/>
-          <w:b/>
-          <w:i w:val="0"/>
-          <w:sz w:val="22"/>
-        </w:rPr>
-        <w:t xml:space="preserve">Slide 10: </w:t>
-      </w:r>
-      <w:r>
-        <w:rPr>
-          <w:rFonts w:ascii="Calibri" w:hAnsi="Calibri" w:eastAsia="Calibri"/>
-          <w:b w:val="0"/>
-          <w:i w:val="0"/>
-          <w:sz w:val="22"/>
-        </w:rPr>
-        <w:t>Thank you / questions</w:t>
+        <w:t>Development Environment, long Challenges lists, every Test table row, Future work deep-dive — mention only if a panelist asks.</w:t>
       </w:r>
     </w:p>
     <w:p>
@@ -1032,7 +1140,7 @@
           <w:i w:val="0"/>
           <w:sz w:val="32"/>
         </w:rPr>
-        <w:t>5. Demo readiness checklist</w:t>
+        <w:t>8. Demo readiness checklist</w:t>
       </w:r>
     </w:p>
     <w:p>
@@ -1062,7 +1170,7 @@
           <w:i w:val="0"/>
           <w:sz w:val="22"/>
         </w:rPr>
-        <w:t>Known working account (or create account live once).</w:t>
+        <w:t>Known working account (login already done before the slot if allowed).</w:t>
       </w:r>
     </w:p>
     <w:p>
@@ -1077,7 +1185,7 @@
           <w:i w:val="0"/>
           <w:sz w:val="22"/>
         </w:rPr>
-        <w:t>Demo Word handout printed or open on a second screen.</w:t>
+        <w:t>Demo A open or one click away; Demo Word handout on a second screen.</w:t>
       </w:r>
     </w:p>
     <w:p>
@@ -1107,7 +1215,7 @@
           <w:i w:val="0"/>
           <w:sz w:val="22"/>
         </w:rPr>
-        <w:t>Backup: screenshots or short screen recording if Wi‑Fi/API fails.</w:t>
+        <w:t>Backup: screenshots if Wi‑Fi/API fails; Demo B rate 20 if Fetch FX is skipped.</w:t>
       </w:r>
     </w:p>
     <w:p>
@@ -1122,7 +1230,7 @@
           <w:i w:val="0"/>
           <w:sz w:val="22"/>
         </w:rPr>
-        <w:t>Demo A works fully offline; Demo B keeps rate 20 if Fetch FX fails or is skipped.</w:t>
+        <w:t>Timer visible: hard stop PPT at 5:00 and switch to the app.</w:t>
       </w:r>
     </w:p>
     <w:p>
@@ -1136,7 +1244,7 @@
           <w:i w:val="0"/>
           <w:sz w:val="32"/>
         </w:rPr>
-        <w:t>6. How to speak (delivery coaching)</w:t>
+        <w:t>9. How to speak (delivery coaching)</w:t>
       </w:r>
     </w:p>
     <w:p>
@@ -1166,7 +1274,7 @@
           <w:i w:val="0"/>
           <w:sz w:val="22"/>
         </w:rPr>
-        <w:t>Point at the screen; say what the user is doing in each click.</w:t>
+        <w:t>PPT: one idea per slide; no reading paragraphs.</w:t>
       </w:r>
     </w:p>
     <w:p>
@@ -1181,7 +1289,22 @@
           <w:i w:val="0"/>
           <w:sz w:val="22"/>
         </w:rPr>
-        <w:t>When a formula appears, pause and explain one number.</w:t>
+        <w:t>Demo: point at the screen; say what the user is doing in each click.</w:t>
+      </w:r>
+    </w:p>
+    <w:p>
+      <w:pPr>
+        <w:pStyle w:val="ListBullet"/>
+        <w:spacing w:after="80"/>
+      </w:pPr>
+      <w:r>
+        <w:rPr>
+          <w:rFonts w:ascii="Calibri" w:hAnsi="Calibri" w:eastAsia="Calibri"/>
+          <w:b w:val="0"/>
+          <w:i w:val="0"/>
+          <w:sz w:val="22"/>
+        </w:rPr>
+        <w:t>Explain one number only (e.g. landed 170) — do not re-derive every line.</w:t>
       </w:r>
     </w:p>
     <w:p>
@@ -1211,7 +1334,7 @@
           <w:i w:val="0"/>
           <w:sz w:val="22"/>
         </w:rPr>
-        <w:t>Share time: one person narrates problem/architecture; the other drives the demo (agree roles).</w:t>
+        <w:t>Share time: one narrates PPT/problem; the other drives the demo (agree once).</w:t>
       </w:r>
     </w:p>
     <w:p>
@@ -1226,7 +1349,7 @@
           <w:i w:val="0"/>
           <w:sz w:val="22"/>
         </w:rPr>
-        <w:t>After each panel question: answer in 2–4 sentences, then stop. Don’t ramble.</w:t>
+        <w:t>Q&amp;A: 2–4 sentences, then stop. Don’t restart a full slide tour.</w:t>
       </w:r>
     </w:p>
     <w:p>
@@ -1240,7 +1363,7 @@
           <w:i w:val="0"/>
           <w:sz w:val="32"/>
         </w:rPr>
-        <w:t>7. Roles for Nixon &amp; Musonda (agreed split)</w:t>
+        <w:t>10. Roles for Nixon &amp; Musonda (agreed split)</w:t>
       </w:r>
     </w:p>
     <w:p>
@@ -1340,7 +1463,7 @@
           <w:i w:val="0"/>
           <w:sz w:val="32"/>
         </w:rPr>
-        <w:t>8. Rehearsal plan (3 runs)</w:t>
+        <w:t>11. Rehearsal plan (match the real 15-minute slot)</w:t>
       </w:r>
     </w:p>
     <w:p>
@@ -1355,7 +1478,7 @@
           <w:i w:val="0"/>
           <w:sz w:val="22"/>
         </w:rPr>
-        <w:t>Run 1 — full talk + Demo A + short Demo B, note every stumble.</w:t>
+        <w:t>Run 1 — PPT only with a 5:00 timer (must finish and switch to browser).</w:t>
       </w:r>
     </w:p>
     <w:p>
@@ -1370,7 +1493,7 @@
           <w:i w:val="0"/>
           <w:sz w:val="22"/>
         </w:rPr>
-        <w:t>Run 2 — Demo A only under time pressure (5 minutes).</w:t>
+        <w:t>Run 2 — Demo A in ≤4 minutes, then 90 s Demo B (or skip B and practise the “mention only” line).</w:t>
       </w:r>
     </w:p>
     <w:p>
@@ -1385,7 +1508,22 @@
           <w:i w:val="0"/>
           <w:sz w:val="22"/>
         </w:rPr>
-        <w:t>Run 3 — cold start with panel-style interruptions (tech change Q, ZRA Q, POS Q, DB Q).</w:t>
+        <w:t>Run 3 — full 15:00 dress: PPT 5 + demo 5–6 + 3 planted questions (POS, ZRA, frameworks).</w:t>
+      </w:r>
+    </w:p>
+    <w:p>
+      <w:pPr>
+        <w:pStyle w:val="ListBullet"/>
+        <w:spacing w:after="80"/>
+      </w:pPr>
+      <w:r>
+        <w:rPr>
+          <w:rFonts w:ascii="Calibri" w:hAnsi="Calibri" w:eastAsia="Calibri"/>
+          <w:b w:val="0"/>
+          <w:i w:val="0"/>
+          <w:sz w:val="22"/>
+        </w:rPr>
+        <w:t>If Run 1 overruns, cut objectives bullets and architecture to one sentence — do not cut the demo.</w:t>
       </w:r>
     </w:p>
     <w:p>
@@ -1399,7 +1537,7 @@
           <w:i w:val="0"/>
           <w:sz w:val="32"/>
         </w:rPr>
-        <w:t>9. Emergency answers (10 seconds)</w:t>
+        <w:t>12. Emergency answers (10 seconds)</w:t>
       </w:r>
     </w:p>
     <w:p>
@@ -1553,7 +1691,7 @@
           <w:i/>
           <w:sz w:val="20"/>
         </w:rPr>
-        <w:t>Train with this guide beside the Technology Justification &amp; Viva Q&amp;A document. Your confidence comes from a rehearsed demo and clear definitions — not from memorising every line of code.</w:t>
+        <w:t>Train with this guide beside the Technology Justification &amp; Viva Q&amp;A document. In a 15-minute slot, confidence comes from a 5-minute PPT you can finish on time and a rehearsed Demo A — not from covering every slide or memorising every line of code.</w:t>
       </w:r>
     </w:p>
     <w:sectPr>

</xml_diff>